<commit_message>
Jun 22 2026 - Added daily_monitor app with ST22, SM37, SM12, DB health + BTP CF deployment
</commit_message>
<xml_diff>
--- a/Scrap_books/S4Hana_CAL_Deployment.docx
+++ b/Scrap_books/S4Hana_CAL_Deployment.docx
@@ -61,7 +61,23 @@
     </w:p>
     <w:p>
       <w:r>
-        <w:t xml:space="preserve">SAP Release – S4 Hana 2025 FPS01 , Fully activated </w:t>
+        <w:t>SAP Release – S4 Hana 2025 FPS</w:t>
+      </w:r>
+      <w:proofErr w:type="gramStart"/>
+      <w:r>
+        <w:t>01 ,</w:t>
+      </w:r>
+      <w:proofErr w:type="gramEnd"/>
+      <w:r>
+        <w:t xml:space="preserve"> </w:t>
+      </w:r>
+      <w:proofErr w:type="gramStart"/>
+      <w:r>
+        <w:t>Fully</w:t>
+      </w:r>
+      <w:proofErr w:type="gramEnd"/>
+      <w:r>
+        <w:t xml:space="preserve"> activated </w:t>
       </w:r>
     </w:p>
     <w:p>
@@ -187,7 +203,15 @@
         <w:t xml:space="preserve"> </w:t>
       </w:r>
       <w:r>
-        <w:t xml:space="preserve">created linked to AWS free tier (Vysh_Learner), chose SAP S4Hana 2025 FPS01 fully activated appliance </w:t>
+        <w:t>created linked to AWS free tier (</w:t>
+      </w:r>
+      <w:proofErr w:type="spellStart"/>
+      <w:r>
+        <w:t>Vysh_Learner</w:t>
+      </w:r>
+      <w:proofErr w:type="spellEnd"/>
+      <w:r>
+        <w:t xml:space="preserve">), chose SAP S4Hana 2025 FPS01 fully activated appliance </w:t>
       </w:r>
       <w:r>
         <w:t>template (valid only for 30 days)</w:t>
@@ -215,7 +239,23 @@
         <w:pStyle w:val="ListParagraph"/>
       </w:pPr>
       <w:r>
-        <w:t>By default AWS free tier account provided 16 service quotas but S4 Hana appliance has minimum requirement of 2 VMs which require atleast 36 quotas, so requested</w:t>
+        <w:t xml:space="preserve">By </w:t>
+      </w:r>
+      <w:proofErr w:type="gramStart"/>
+      <w:r>
+        <w:t>default</w:t>
+      </w:r>
+      <w:proofErr w:type="gramEnd"/>
+      <w:r>
+        <w:t xml:space="preserve"> AWS free tier account provided 16 service quotas but S4 Hana appliance has minimum requirement of 2 VMs which require </w:t>
+      </w:r>
+      <w:proofErr w:type="spellStart"/>
+      <w:r>
+        <w:t>atleast</w:t>
+      </w:r>
+      <w:proofErr w:type="spellEnd"/>
+      <w:r>
+        <w:t xml:space="preserve"> 36 quotas, so requested</w:t>
       </w:r>
       <w:r>
         <w:t xml:space="preserve"> </w:t>
@@ -503,6 +543,38 @@
     <w:p>
       <w:pPr>
         <w:pStyle w:val="ListParagraph"/>
+        <w:rPr>
+          <w:noProof/>
+        </w:rPr>
+      </w:pPr>
+    </w:p>
+    <w:p>
+      <w:pPr>
+        <w:pStyle w:val="ListParagraph"/>
+        <w:rPr>
+          <w:noProof/>
+        </w:rPr>
+      </w:pPr>
+    </w:p>
+    <w:p>
+      <w:pPr>
+        <w:pStyle w:val="ListParagraph"/>
+        <w:rPr>
+          <w:noProof/>
+        </w:rPr>
+      </w:pPr>
+    </w:p>
+    <w:p>
+      <w:pPr>
+        <w:pStyle w:val="ListParagraph"/>
+        <w:rPr>
+          <w:noProof/>
+        </w:rPr>
+      </w:pPr>
+    </w:p>
+    <w:p>
+      <w:pPr>
+        <w:pStyle w:val="ListParagraph"/>
         <w:numPr>
           <w:ilvl w:val="0"/>
           <w:numId w:val="1"/>
@@ -515,18 +587,24 @@
         <w:rPr>
           <w:noProof/>
         </w:rPr>
+        <w:lastRenderedPageBreak/>
         <w:t>After approx. 2 hours S4 Hana was successfully deployed on SAP CAL , did all system health verifications along with screenshots(saved in screenshots folder)</w:t>
       </w:r>
       <w:r>
         <w:rPr>
           <w:noProof/>
         </w:rPr>
-        <w:lastRenderedPageBreak/>
+        <w:t xml:space="preserve"> </w:t>
+      </w:r>
+      <w:r>
+        <w:rPr>
+          <w:noProof/>
+        </w:rPr>
         <w:drawing>
-          <wp:inline distT="0" distB="0" distL="0" distR="0" wp14:anchorId="3C17CA57" wp14:editId="193F9E5C">
-            <wp:extent cx="5943600" cy="1606550"/>
+          <wp:inline distT="0" distB="0" distL="0" distR="0" wp14:anchorId="10E2A045" wp14:editId="06E1A702">
+            <wp:extent cx="5943600" cy="1905000"/>
             <wp:effectExtent l="0" t="0" r="0" b="0"/>
-            <wp:docPr id="37669901" name="Picture 1"/>
+            <wp:docPr id="5755311" name="Picture 1"/>
             <wp:cNvGraphicFramePr>
               <a:graphicFrameLocks xmlns:a="http://schemas.openxmlformats.org/drawingml/2006/main" noChangeAspect="1"/>
             </wp:cNvGraphicFramePr>
@@ -534,32 +612,23 @@
               <a:graphicData uri="http://schemas.openxmlformats.org/drawingml/2006/picture">
                 <pic:pic xmlns:pic="http://schemas.openxmlformats.org/drawingml/2006/picture">
                   <pic:nvPicPr>
-                    <pic:cNvPr id="37669901" name=""/>
+                    <pic:cNvPr id="5755311" name=""/>
                     <pic:cNvPicPr/>
                   </pic:nvPicPr>
-                  <pic:blipFill rotWithShape="1">
+                  <pic:blipFill>
                     <a:blip r:embed="rId11"/>
-                    <a:srcRect b="19427"/>
                     <a:stretch>
                       <a:fillRect/>
                     </a:stretch>
                   </pic:blipFill>
-                  <pic:spPr bwMode="auto">
+                  <pic:spPr>
                     <a:xfrm>
                       <a:off x="0" y="0"/>
-                      <a:ext cx="5943600" cy="1606550"/>
+                      <a:ext cx="5943600" cy="1905000"/>
                     </a:xfrm>
                     <a:prstGeom prst="rect">
                       <a:avLst/>
                     </a:prstGeom>
-                    <a:ln>
-                      <a:noFill/>
-                    </a:ln>
-                    <a:extLst>
-                      <a:ext uri="{53640926-AAD7-44D8-BBD7-CCE9431645EC}">
-                        <a14:shadowObscured xmlns:a14="http://schemas.microsoft.com/office/drawing/2010/main"/>
-                      </a:ext>
-                    </a:extLst>
                   </pic:spPr>
                 </pic:pic>
               </a:graphicData>
@@ -578,10 +647,10 @@
           <w:noProof/>
         </w:rPr>
         <w:drawing>
-          <wp:inline distT="0" distB="0" distL="0" distR="0" wp14:anchorId="66A67E55" wp14:editId="42977C8F">
-            <wp:extent cx="5943600" cy="2848610"/>
-            <wp:effectExtent l="0" t="0" r="0" b="8890"/>
-            <wp:docPr id="799574920" name="Picture 1"/>
+          <wp:inline distT="0" distB="0" distL="0" distR="0" wp14:anchorId="1E5C4938" wp14:editId="1B68B7FA">
+            <wp:extent cx="5943600" cy="1855470"/>
+            <wp:effectExtent l="0" t="0" r="0" b="0"/>
+            <wp:docPr id="895877313" name="Picture 1"/>
             <wp:cNvGraphicFramePr>
               <a:graphicFrameLocks xmlns:a="http://schemas.openxmlformats.org/drawingml/2006/main" noChangeAspect="1"/>
             </wp:cNvGraphicFramePr>
@@ -589,7 +658,7 @@
               <a:graphicData uri="http://schemas.openxmlformats.org/drawingml/2006/picture">
                 <pic:pic xmlns:pic="http://schemas.openxmlformats.org/drawingml/2006/picture">
                   <pic:nvPicPr>
-                    <pic:cNvPr id="799574920" name=""/>
+                    <pic:cNvPr id="895877313" name=""/>
                     <pic:cNvPicPr/>
                   </pic:nvPicPr>
                   <pic:blipFill>
@@ -601,7 +670,7 @@
                   <pic:spPr>
                     <a:xfrm>
                       <a:off x="0" y="0"/>
-                      <a:ext cx="5943600" cy="2848610"/>
+                      <a:ext cx="5943600" cy="1855470"/>
                     </a:xfrm>
                     <a:prstGeom prst="rect">
                       <a:avLst/>
@@ -628,10 +697,10 @@
           <w:noProof/>
         </w:rPr>
         <w:drawing>
-          <wp:inline distT="0" distB="0" distL="0" distR="0" wp14:anchorId="5EC6FBA2" wp14:editId="080EE23B">
-            <wp:extent cx="5943600" cy="1819275"/>
-            <wp:effectExtent l="0" t="0" r="0" b="9525"/>
-            <wp:docPr id="1740714581" name="Picture 1"/>
+          <wp:inline distT="0" distB="0" distL="0" distR="0" wp14:anchorId="00624391" wp14:editId="29E698A1">
+            <wp:extent cx="5943600" cy="2792730"/>
+            <wp:effectExtent l="0" t="0" r="0" b="7620"/>
+            <wp:docPr id="150671296" name="Picture 1"/>
             <wp:cNvGraphicFramePr>
               <a:graphicFrameLocks xmlns:a="http://schemas.openxmlformats.org/drawingml/2006/main" noChangeAspect="1"/>
             </wp:cNvGraphicFramePr>
@@ -639,7 +708,7 @@
               <a:graphicData uri="http://schemas.openxmlformats.org/drawingml/2006/picture">
                 <pic:pic xmlns:pic="http://schemas.openxmlformats.org/drawingml/2006/picture">
                   <pic:nvPicPr>
-                    <pic:cNvPr id="1740714581" name=""/>
+                    <pic:cNvPr id="150671296" name=""/>
                     <pic:cNvPicPr/>
                   </pic:nvPicPr>
                   <pic:blipFill>
@@ -651,7 +720,7 @@
                   <pic:spPr>
                     <a:xfrm>
                       <a:off x="0" y="0"/>
-                      <a:ext cx="5943600" cy="1819275"/>
+                      <a:ext cx="5943600" cy="2792730"/>
                     </a:xfrm>
                     <a:prstGeom prst="rect">
                       <a:avLst/>

</xml_diff>